<commit_message>
Update README.md and MER.drawio to include student following feature
</commit_message>
<xml_diff>
--- a/Tarea1/Informe/Informe.docx
+++ b/Tarea1/Informe/Informe.docx
@@ -581,6 +581,7 @@
           <w:sz w:val="36"/>
           <w:szCs w:val="36"/>
         </w:rPr>
+        <w:keepNext w:val="1"/>
       </w:pPr>
       <w:r>
         <w:rPr>
@@ -636,6 +637,7 @@
           <w:sz w:val="36"/>
           <w:szCs w:val="36"/>
         </w:rPr>
+        <w:keepNext w:val="1"/>
       </w:pPr>
       <w:r>
         <w:rPr>
@@ -674,6 +676,7 @@
           <w:sz w:val="36"/>
           <w:szCs w:val="36"/>
         </w:rPr>
+        <w:keepNext w:val="1"/>
       </w:pPr>
       <w:r>
         <w:rPr>
@@ -771,6 +774,24 @@
           <w:szCs w:val="24"/>
           <w:rtl w:val="0"/>
         </w:rPr>
+        <w:t>● Permitir que un estudiante siga a otros usuarios con intereses similares o que puedan ofrecer mentoría, sin requerir aceptación.</w:t>
+      </w:r>
+    </w:p>
+    <w:p>
+      <w:pPr>
+        <w:spacing w:line="331.2" w:lineRule="auto"/>
+        <w:ind w:left="800" w:hanging="260"/>
+        <w:rPr>
+          <w:sz w:val="24"/>
+          <w:szCs w:val="24"/>
+        </w:rPr>
+      </w:pPr>
+      <w:r>
+        <w:rPr>
+          <w:sz w:val="24"/>
+          <w:szCs w:val="24"/>
+          <w:rtl w:val="0"/>
+        </w:rPr>
         <w:t xml:space="preserve">● Permitir la creación de publicaciones de diferente tipo, como preguntas, recursos, noticias o contenido relacionado con la vida universitaria.</w:t>
       </w:r>
     </w:p>
@@ -872,6 +893,7 @@
           <w:sz w:val="36"/>
           <w:szCs w:val="36"/>
         </w:rPr>
+        <w:keepNext w:val="1"/>
       </w:pPr>
       <w:r>
         <w:rPr>
@@ -908,6 +930,7 @@
           <w:sz w:val="30"/>
           <w:szCs w:val="30"/>
         </w:rPr>
+        <w:keepNext w:val="1"/>
       </w:pPr>
       <w:r>
         <w:rPr>
@@ -949,7 +972,7 @@
           <w:szCs w:val="24"/>
           <w:rtl w:val="0"/>
         </w:rPr>
-        <w:t xml:space="preserve">Por ejemplo, un usuario puede publicar contenido, pertenecer a grupos, crear eventos, participar en chats, enviar mensajes y solicitar conexiones con otros estudiantes.</w:t>
+        <w:t>Por ejemplo, un usuario puede publicar contenido, pertenecer a grupos, crear eventos, participar en chats, enviar mensajes, seguir a otros estudiantes y solicitar conexiones.</w:t>
       </w:r>
     </w:p>
     <w:p>
@@ -959,6 +982,7 @@
           <w:sz w:val="30"/>
           <w:szCs w:val="30"/>
         </w:rPr>
+        <w:keepNext w:val="1"/>
       </w:pPr>
       <w:r>
         <w:rPr>
@@ -1010,6 +1034,7 @@
           <w:sz w:val="30"/>
           <w:szCs w:val="30"/>
         </w:rPr>
+        <w:keepNext w:val="1"/>
       </w:pPr>
       <w:r>
         <w:rPr>
@@ -1061,6 +1086,7 @@
           <w:sz w:val="30"/>
           <w:szCs w:val="30"/>
         </w:rPr>
+        <w:keepNext w:val="1"/>
       </w:pPr>
       <w:r>
         <w:rPr>
@@ -1112,6 +1138,7 @@
           <w:sz w:val="30"/>
           <w:szCs w:val="30"/>
         </w:rPr>
+        <w:keepNext w:val="1"/>
       </w:pPr>
       <w:r>
         <w:rPr>
@@ -1163,6 +1190,7 @@
           <w:sz w:val="30"/>
           <w:szCs w:val="30"/>
         </w:rPr>
+        <w:keepNext w:val="1"/>
       </w:pPr>
       <w:r>
         <w:rPr>
@@ -1214,6 +1242,7 @@
           <w:sz w:val="30"/>
           <w:szCs w:val="30"/>
         </w:rPr>
+        <w:keepNext w:val="1"/>
       </w:pPr>
       <w:r>
         <w:rPr>
@@ -1265,6 +1294,7 @@
           <w:sz w:val="30"/>
           <w:szCs w:val="30"/>
         </w:rPr>
+        <w:keepNext w:val="1"/>
       </w:pPr>
       <w:r>
         <w:rPr>
@@ -1318,6 +1348,7 @@
           <w:sz w:val="36"/>
           <w:szCs w:val="36"/>
         </w:rPr>
+        <w:keepNext w:val="1"/>
       </w:pPr>
       <w:r>
         <w:rPr>
@@ -1354,6 +1385,7 @@
           <w:sz w:val="30"/>
           <w:szCs w:val="30"/>
         </w:rPr>
+        <w:keepNext w:val="1"/>
       </w:pPr>
       <w:r>
         <w:rPr>
@@ -1371,6 +1403,7 @@
           <w:sz w:val="24"/>
           <w:szCs w:val="24"/>
         </w:rPr>
+        <w:keepNext w:val="1"/>
       </w:pPr>
       <w:r>
         <w:rPr>
@@ -1567,6 +1600,7 @@
           <w:sz w:val="30"/>
           <w:szCs w:val="30"/>
         </w:rPr>
+        <w:keepNext w:val="1"/>
       </w:pPr>
       <w:r>
         <w:rPr>
@@ -1584,6 +1618,7 @@
           <w:sz w:val="24"/>
           <w:szCs w:val="24"/>
         </w:rPr>
+        <w:keepNext w:val="1"/>
       </w:pPr>
       <w:r>
         <w:rPr>
@@ -1690,6 +1725,7 @@
           <w:sz w:val="30"/>
           <w:szCs w:val="30"/>
         </w:rPr>
+        <w:keepNext w:val="1"/>
       </w:pPr>
       <w:r>
         <w:rPr>
@@ -1707,6 +1743,7 @@
           <w:sz w:val="24"/>
           <w:szCs w:val="24"/>
         </w:rPr>
+        <w:keepNext w:val="1"/>
       </w:pPr>
       <w:r>
         <w:rPr>
@@ -1849,6 +1886,7 @@
           <w:sz w:val="30"/>
           <w:szCs w:val="30"/>
         </w:rPr>
+        <w:keepNext w:val="1"/>
       </w:pPr>
       <w:r>
         <w:rPr>
@@ -1866,6 +1904,7 @@
           <w:sz w:val="24"/>
           <w:szCs w:val="24"/>
         </w:rPr>
+        <w:keepNext w:val="1"/>
       </w:pPr>
       <w:r>
         <w:rPr>
@@ -2026,6 +2065,7 @@
           <w:sz w:val="30"/>
           <w:szCs w:val="30"/>
         </w:rPr>
+        <w:keepNext w:val="1"/>
       </w:pPr>
       <w:r>
         <w:rPr>
@@ -2043,6 +2083,7 @@
           <w:sz w:val="24"/>
           <w:szCs w:val="24"/>
         </w:rPr>
+        <w:keepNext w:val="1"/>
       </w:pPr>
       <w:r>
         <w:rPr>
@@ -2131,6 +2172,7 @@
           <w:sz w:val="30"/>
           <w:szCs w:val="30"/>
         </w:rPr>
+        <w:keepNext w:val="1"/>
       </w:pPr>
       <w:r>
         <w:rPr>
@@ -2148,6 +2190,7 @@
           <w:sz w:val="24"/>
           <w:szCs w:val="24"/>
         </w:rPr>
+        <w:keepNext w:val="1"/>
       </w:pPr>
       <w:r>
         <w:rPr>
@@ -2254,6 +2297,7 @@
           <w:sz w:val="30"/>
           <w:szCs w:val="30"/>
         </w:rPr>
+        <w:keepNext w:val="1"/>
       </w:pPr>
       <w:r>
         <w:rPr>
@@ -2271,6 +2315,7 @@
           <w:sz w:val="24"/>
           <w:szCs w:val="24"/>
         </w:rPr>
+        <w:keepNext w:val="1"/>
       </w:pPr>
       <w:r>
         <w:rPr>
@@ -2395,6 +2440,7 @@
           <w:sz w:val="30"/>
           <w:szCs w:val="30"/>
         </w:rPr>
+        <w:keepNext w:val="1"/>
       </w:pPr>
       <w:r>
         <w:rPr>
@@ -2412,6 +2458,7 @@
           <w:sz w:val="24"/>
           <w:szCs w:val="24"/>
         </w:rPr>
+        <w:keepNext w:val="1"/>
       </w:pPr>
       <w:r>
         <w:rPr>
@@ -2537,6 +2584,7 @@
           <w:sz w:val="36"/>
           <w:szCs w:val="36"/>
         </w:rPr>
+        <w:keepNext w:val="1"/>
       </w:pPr>
       <w:r>
         <w:rPr>
@@ -2573,6 +2621,7 @@
           <w:sz w:val="30"/>
           <w:szCs w:val="30"/>
         </w:rPr>
+        <w:keepNext w:val="1"/>
       </w:pPr>
       <w:r>
         <w:rPr>
@@ -2590,6 +2639,7 @@
           <w:sz w:val="24"/>
           <w:szCs w:val="24"/>
         </w:rPr>
+        <w:keepNext w:val="1"/>
       </w:pPr>
       <w:r>
         <w:rPr>
@@ -2643,6 +2693,7 @@
           <w:sz w:val="30"/>
           <w:szCs w:val="30"/>
         </w:rPr>
+        <w:keepNext w:val="1"/>
       </w:pPr>
       <w:r>
         <w:rPr>
@@ -2660,6 +2711,7 @@
           <w:sz w:val="24"/>
           <w:szCs w:val="24"/>
         </w:rPr>
+        <w:keepNext w:val="1"/>
       </w:pPr>
       <w:r>
         <w:rPr>
@@ -2711,6 +2763,7 @@
           <w:sz w:val="30"/>
           <w:szCs w:val="30"/>
         </w:rPr>
+        <w:keepNext w:val="1"/>
       </w:pPr>
       <w:r>
         <w:rPr>
@@ -2746,6 +2799,7 @@
           <w:sz w:val="27"/>
           <w:szCs w:val="27"/>
         </w:rPr>
+        <w:keepNext w:val="1"/>
       </w:pPr>
       <w:r>
         <w:rPr>
@@ -2764,6 +2818,7 @@
           <w:sz w:val="24"/>
           <w:szCs w:val="24"/>
         </w:rPr>
+        <w:keepNext w:val="1"/>
       </w:pPr>
       <w:r>
         <w:rPr>
@@ -2816,6 +2871,7 @@
           <w:sz w:val="27"/>
           <w:szCs w:val="27"/>
         </w:rPr>
+        <w:keepNext w:val="1"/>
       </w:pPr>
       <w:r>
         <w:rPr>
@@ -2834,6 +2890,7 @@
           <w:sz w:val="24"/>
           <w:szCs w:val="24"/>
         </w:rPr>
+        <w:keepNext w:val="1"/>
       </w:pPr>
       <w:r>
         <w:rPr>
@@ -2885,6 +2942,7 @@
           <w:sz w:val="30"/>
           <w:szCs w:val="30"/>
         </w:rPr>
+        <w:keepNext w:val="1"/>
       </w:pPr>
       <w:r>
         <w:rPr>
@@ -2920,6 +2978,7 @@
           <w:sz w:val="27"/>
           <w:szCs w:val="27"/>
         </w:rPr>
+        <w:keepNext w:val="1"/>
       </w:pPr>
       <w:r>
         <w:rPr>
@@ -2938,6 +2997,7 @@
           <w:sz w:val="24"/>
           <w:szCs w:val="24"/>
         </w:rPr>
+        <w:keepNext w:val="1"/>
       </w:pPr>
       <w:r>
         <w:rPr>
@@ -2990,6 +3050,7 @@
           <w:sz w:val="27"/>
           <w:szCs w:val="27"/>
         </w:rPr>
+        <w:keepNext w:val="1"/>
       </w:pPr>
       <w:r>
         <w:rPr>
@@ -3008,6 +3069,7 @@
           <w:sz w:val="24"/>
           <w:szCs w:val="24"/>
         </w:rPr>
+        <w:keepNext w:val="1"/>
       </w:pPr>
       <w:r>
         <w:rPr>
@@ -3059,6 +3121,7 @@
           <w:sz w:val="30"/>
           <w:szCs w:val="30"/>
         </w:rPr>
+        <w:keepNext w:val="1"/>
       </w:pPr>
       <w:r>
         <w:rPr>
@@ -3076,6 +3139,7 @@
           <w:sz w:val="24"/>
           <w:szCs w:val="24"/>
         </w:rPr>
+        <w:keepNext w:val="1"/>
       </w:pPr>
       <w:r>
         <w:rPr>
@@ -3127,6 +3191,7 @@
           <w:sz w:val="30"/>
           <w:szCs w:val="30"/>
         </w:rPr>
+        <w:keepNext w:val="1"/>
       </w:pPr>
       <w:r>
         <w:rPr>
@@ -3144,6 +3209,7 @@
           <w:sz w:val="24"/>
           <w:szCs w:val="24"/>
         </w:rPr>
+        <w:keepNext w:val="1"/>
       </w:pPr>
       <w:r>
         <w:rPr>
@@ -3197,6 +3263,7 @@
           <w:sz w:val="30"/>
           <w:szCs w:val="30"/>
         </w:rPr>
+        <w:keepNext w:val="1"/>
       </w:pPr>
       <w:r>
         <w:rPr>
@@ -3214,6 +3281,7 @@
           <w:sz w:val="24"/>
           <w:szCs w:val="24"/>
         </w:rPr>
+        <w:keepNext w:val="1"/>
       </w:pPr>
       <w:r>
         <w:rPr>
@@ -3267,6 +3335,7 @@
           <w:sz w:val="30"/>
           <w:szCs w:val="30"/>
         </w:rPr>
+        <w:keepNext w:val="1"/>
       </w:pPr>
       <w:r>
         <w:rPr>
@@ -3284,6 +3353,7 @@
           <w:sz w:val="24"/>
           <w:szCs w:val="24"/>
         </w:rPr>
+        <w:keepNext w:val="1"/>
       </w:pPr>
       <w:r>
         <w:rPr>
@@ -3328,6 +3398,110 @@
           <w:rtl w:val="0"/>
         </w:rPr>
         <w:t xml:space="preserve">Esta relación permite representar el envío de imágenes, documentos u otros recursos dentro de una conversación.</w:t>
+      </w:r>
+    </w:p>
+    <w:p>
+      <w:pPr>
+        <w:spacing w:after="100" w:before="280" w:line="331.2" w:lineRule="auto"/>
+        <w:rPr>
+          <w:sz w:val="30"/>
+          <w:szCs w:val="30"/>
+        </w:rPr>
+        <w:keepNext w:val="1"/>
+      </w:pPr>
+      <w:r>
+        <w:rPr>
+          <w:sz w:val="30"/>
+          <w:szCs w:val="30"/>
+          <w:rtl w:val="0"/>
+        </w:rPr>
+        <w:t>6.9 Usuario – Usuario</w:t>
+      </w:r>
+    </w:p>
+    <w:p>
+      <w:pPr>
+        <w:spacing w:line="331.2" w:lineRule="auto"/>
+        <w:rPr>
+          <w:sz w:val="24"/>
+          <w:szCs w:val="24"/>
+        </w:rPr>
+        <w:keepNext w:val="1"/>
+      </w:pPr>
+      <w:r>
+        <w:rPr>
+          <w:sz w:val="24"/>
+          <w:szCs w:val="24"/>
+          <w:rtl w:val="0"/>
+        </w:rPr>
+        <w:t>Relación: SIGUE | Cardinalidad: M:N.</w:t>
+      </w:r>
+    </w:p>
+    <w:p>
+      <w:pPr>
+        <w:spacing w:line="331.2" w:lineRule="auto"/>
+        <w:rPr>
+          <w:sz w:val="24"/>
+          <w:szCs w:val="24"/>
+        </w:rPr>
+      </w:pPr>
+      <w:r>
+        <w:rPr>
+          <w:sz w:val="24"/>
+          <w:szCs w:val="24"/>
+          <w:rtl w:val="0"/>
+        </w:rPr>
+        <w:t>Un usuario, en el rol de seguidor, puede seguir a cero o muchos usuarios. Un usuario, en el rol de seguido, puede tener cero o muchos seguidores. Cada seguimiento vincula a un único seguidor con un único seguido.</w:t>
+      </w:r>
+    </w:p>
+    <w:p>
+      <w:pPr>
+        <w:spacing w:line="331.2" w:lineRule="auto"/>
+        <w:rPr>
+          <w:sz w:val="24"/>
+          <w:szCs w:val="24"/>
+        </w:rPr>
+      </w:pPr>
+      <w:r>
+        <w:rPr>
+          <w:sz w:val="24"/>
+          <w:szCs w:val="24"/>
+          <w:rtl w:val="0"/>
+        </w:rPr>
+        <w:t>SIGUE es una relación recursiva y dirigida: si Ana sigue a Luis, esto no implica que Luis siga a Ana. No se requiere una solicitud ni aceptación, y el seguimiento es independiente de Conexión.</w:t>
+      </w:r>
+    </w:p>
+    <w:p>
+      <w:pPr>
+        <w:spacing w:line="331.2" w:lineRule="auto"/>
+        <w:rPr>
+          <w:sz w:val="24"/>
+          <w:szCs w:val="24"/>
+        </w:rPr>
+      </w:pPr>
+      <w:r>
+        <w:rPr>
+          <w:sz w:val="24"/>
+          <w:szCs w:val="24"/>
+          <w:rtl w:val="0"/>
+        </w:rPr>
+        <w:t>Fecha_seguimiento: registra cuándo comenzó el seguimiento y pertenece a la relación, porque depende del par de usuarios.</w:t>
+      </w:r>
+    </w:p>
+    <w:p>
+      <w:pPr>
+        <w:spacing w:line="331.2" w:lineRule="auto"/>
+        <w:rPr>
+          <w:sz w:val="24"/>
+          <w:szCs w:val="24"/>
+        </w:rPr>
+      </w:pPr>
+      <w:r>
+        <w:rPr>
+          <w:sz w:val="24"/>
+          <w:szCs w:val="24"/>
+          <w:rtl w:val="0"/>
+        </w:rPr>
+        <w:t>Reglas: el seguidor y el seguido deben ser distintos, y cada par ordenado (seguidor, seguido) puede aparecer una sola vez. Los pares (Ana, Luis) y (Luis, Ana) son distintos y pueden coexistir.</w:t>
       </w:r>
     </w:p>
     <w:p>
@@ -3356,6 +3530,7 @@
           <w:sz w:val="36"/>
           <w:szCs w:val="36"/>
         </w:rPr>
+        <w:keepNext w:val="1"/>
       </w:pPr>
       <w:r>
         <w:rPr>
@@ -3417,9 +3592,9 @@
         </w:rPr>
         <w:drawing>
           <wp:inline distB="114300" distT="114300" distL="114300" distR="114300">
-            <wp:extent cx="5731200" cy="4902200"/>
+            <wp:extent cx="5731200" cy="4898898"/>
             <wp:effectExtent b="0" l="0" r="0" t="0"/>
-            <wp:docPr id="1" name="image1.png"/>
+            <wp:docPr id="1" name="image1.png" descr="MER con ocho entidades y doce relaciones: incluye SIGUE entre usuarios y conserva Conexión."/>
             <a:graphic>
               <a:graphicData uri="http://schemas.openxmlformats.org/drawingml/2006/picture">
                 <pic:pic>
@@ -3437,7 +3612,7 @@
                   <pic:spPr>
                     <a:xfrm>
                       <a:off x="0" y="0"/>
-                      <a:ext cx="5731200" cy="4902200"/>
+                      <a:ext cx="5731200" cy="4898898"/>
                     </a:xfrm>
                     <a:prstGeom prst="rect"/>
                     <a:ln/>
@@ -3485,7 +3660,7 @@
           <w:szCs w:val="24"/>
           <w:rtl w:val="0"/>
         </w:rPr>
-        <w:t xml:space="preserve">El diagrama contiene ocho entidades. Las etiquetas 1:N y M:N indican las cardinalidades máximas; en ADJUNTA se explicita además la participación opcional. Conexión se relaciona con Usuario mediante SOLICITA y RECIBE, ambas 1:N. Los nombres de atributos se muestran en minúsculas y sin tildes para facilitar su lectura técnica.</w:t>
+        <w:t>El diagrama contiene ocho entidades y doce relaciones. Las etiquetas 1:N y M:N indican las cardinalidades máximas. SIGUE es una relación recursiva entre usuarios, con los roles seguidor y seguido; ambos admiten cero o muchas participaciones. Conexión conserva SOLICITA y RECIBE, ambas 1:N. Los nombres de atributos se muestran en minúsculas y sin tildes.</w:t>
       </w:r>
     </w:p>
     <w:p>
@@ -3497,6 +3672,7 @@
           <w:sz w:val="36"/>
           <w:szCs w:val="36"/>
         </w:rPr>
+        <w:keepNext w:val="1"/>
       </w:pPr>
       <w:r>
         <w:rPr>
@@ -3533,6 +3709,7 @@
           <w:sz w:val="30"/>
           <w:szCs w:val="30"/>
         </w:rPr>
+        <w:keepNext w:val="1"/>
       </w:pPr>
       <w:r>
         <w:rPr>
@@ -3584,6 +3761,7 @@
           <w:sz w:val="30"/>
           <w:szCs w:val="30"/>
         </w:rPr>
+        <w:keepNext w:val="1"/>
       </w:pPr>
       <w:r>
         <w:rPr>
@@ -3642,7 +3820,7 @@
           <w:szCs w:val="24"/>
           <w:rtl w:val="0"/>
         </w:rPr>
-        <w:t xml:space="preserve">Este diseño interpreta la conexión entre compañeros como un vínculo que requiere aceptación. No representa un seguimiento unilateral: si la actividad exige también seguir usuarios sin aceptación, esa función necesitaría una relación adicional.</w:t>
+        <w:t>El seguimiento y la conexión son independientes. SIGUE permite seguir a otro estudiante sin aceptación ni reciprocidad. Conexión conserva las solicitudes y su aceptación o rechazo. Seguir a alguien no crea ni acepta una conexión, y aceptar una conexión no crea seguimientos automáticamente.</w:t>
       </w:r>
     </w:p>
     <w:p>
@@ -3652,6 +3830,7 @@
           <w:sz w:val="30"/>
           <w:szCs w:val="30"/>
         </w:rPr>
+        <w:keepNext w:val="1"/>
       </w:pPr>
       <w:r>
         <w:rPr>
@@ -3720,6 +3899,7 @@
           <w:sz w:val="30"/>
           <w:szCs w:val="30"/>
         </w:rPr>
+        <w:keepNext w:val="1"/>
       </w:pPr>
       <w:r>
         <w:rPr>
@@ -3805,6 +3985,7 @@
           <w:sz w:val="30"/>
           <w:szCs w:val="30"/>
         </w:rPr>
+        <w:keepNext w:val="1"/>
       </w:pPr>
       <w:r>
         <w:rPr>
@@ -3889,6 +4070,24 @@
     <w:p>
       <w:pPr>
         <w:spacing w:line="331.2" w:lineRule="auto"/>
+        <w:ind w:left="800" w:hanging="260"/>
+        <w:rPr>
+          <w:sz w:val="24"/>
+          <w:szCs w:val="24"/>
+        </w:rPr>
+      </w:pPr>
+      <w:r>
+        <w:rPr>
+          <w:sz w:val="24"/>
+          <w:szCs w:val="24"/>
+          <w:rtl w:val="0"/>
+        </w:rPr>
+        <w:t>● Usuario – Usuario, mediante SIGUE.</w:t>
+      </w:r>
+    </w:p>
+    <w:p>
+      <w:pPr>
+        <w:spacing w:line="331.2" w:lineRule="auto"/>
         <w:rPr>
           <w:sz w:val="24"/>
           <w:szCs w:val="24"/>
@@ -3910,6 +4109,7 @@
           <w:sz w:val="30"/>
           <w:szCs w:val="30"/>
         </w:rPr>
+        <w:keepNext w:val="1"/>
       </w:pPr>
       <w:r>
         <w:rPr>
@@ -3934,7 +4134,7 @@
           <w:szCs w:val="24"/>
           <w:rtl w:val="0"/>
         </w:rPr>
-        <w:t xml:space="preserve">Se definieron atributos propios para las relaciones PERTENECE y PARTICIPA. Estos atributos se incluyen en el diagrama junto al nombre de cada relación. Las fechas y el estado de las conexiones se almacenan en la entidad Conexión.</w:t>
+        <w:t>Se definieron atributos propios para las relaciones PERTENECE, PARTICIPA y SIGUE. Estos atributos se incluyen en el diagrama junto al nombre de cada relación. Las fechas y el estado de las solicitudes de conexión se almacenan en la entidad Conexión.</w:t>
       </w:r>
     </w:p>
     <w:p>
@@ -3993,6 +4193,24 @@
     <w:p>
       <w:pPr>
         <w:spacing w:line="331.2" w:lineRule="auto"/>
+        <w:ind w:left="800" w:hanging="260"/>
+        <w:rPr>
+          <w:sz w:val="24"/>
+          <w:szCs w:val="24"/>
+        </w:rPr>
+      </w:pPr>
+      <w:r>
+        <w:rPr>
+          <w:sz w:val="24"/>
+          <w:szCs w:val="24"/>
+          <w:rtl w:val="0"/>
+        </w:rPr>
+        <w:t>● Fecha_seguimiento en SIGUE (Usuario–Usuario): registra el inicio del seguimiento entre el seguidor y el seguido.</w:t>
+      </w:r>
+    </w:p>
+    <w:p>
+      <w:pPr>
+        <w:spacing w:line="331.2" w:lineRule="auto"/>
         <w:rPr>
           <w:sz w:val="24"/>
           <w:szCs w:val="24"/>
@@ -4014,6 +4232,7 @@
           <w:sz w:val="30"/>
           <w:szCs w:val="30"/>
         </w:rPr>
+        <w:keepNext w:val="1"/>
       </w:pPr>
       <w:r>
         <w:rPr>
@@ -4084,6 +4303,7 @@
           <w:sz w:val="36"/>
           <w:szCs w:val="36"/>
         </w:rPr>
+        <w:keepNext w:val="1"/>
       </w:pPr>
       <w:r>
         <w:rPr>
@@ -4103,6 +4323,7 @@
           <w:sz w:val="27"/>
           <w:szCs w:val="27"/>
         </w:rPr>
+        <w:keepNext w:val="1"/>
       </w:pPr>
       <w:r>
         <w:rPr>
@@ -4222,6 +4443,7 @@
           <w:sz w:val="36"/>
           <w:szCs w:val="36"/>
         </w:rPr>
+        <w:keepNext w:val="1"/>
       </w:pPr>
       <w:r>
         <w:rPr>

</xml_diff>

<commit_message>
conclusion juan pablo correa
</commit_message>
<xml_diff>
--- a/Tarea1/Informe/Informe.docx
+++ b/Tarea1/Informe/Informe.docx
@@ -907,23 +907,7 @@
           <w:sz w:val="24"/>
           <w:szCs w:val="24"/>
         </w:rPr>
-        <w:t xml:space="preserve">Estos grupos pueden utilizarse, por ejemplo, para estudiar una materia, participar en un </w:t>
-      </w:r>
-      <w:proofErr w:type="spellStart"/>
-      <w:r>
-        <w:rPr>
-          <w:sz w:val="24"/>
-          <w:szCs w:val="24"/>
-        </w:rPr>
-        <w:t>hackatón</w:t>
-      </w:r>
-      <w:proofErr w:type="spellEnd"/>
-      <w:r>
-        <w:rPr>
-          <w:sz w:val="24"/>
-          <w:szCs w:val="24"/>
-        </w:rPr>
-        <w:t>, crear un club de programación, videojuegos u otros intereses.</w:t>
+        <w:t>Estos grupos pueden utilizarse, por ejemplo, para estudiar una materia, participar en un hackatón, crear un club de programación, videojuegos u otros intereses.</w:t>
       </w:r>
     </w:p>
     <w:p>
@@ -1258,23 +1242,7 @@
           <w:sz w:val="24"/>
           <w:szCs w:val="24"/>
         </w:rPr>
-        <w:t xml:space="preserve">● </w:t>
-      </w:r>
-      <w:proofErr w:type="spellStart"/>
-      <w:r>
-        <w:rPr>
-          <w:sz w:val="24"/>
-          <w:szCs w:val="24"/>
-        </w:rPr>
-        <w:t>Id_usuario</w:t>
-      </w:r>
-      <w:proofErr w:type="spellEnd"/>
-      <w:r>
-        <w:rPr>
-          <w:sz w:val="24"/>
-          <w:szCs w:val="24"/>
-        </w:rPr>
-        <w:t>: permite identificar de forma única a cada usuario.</w:t>
+        <w:t>● Id_usuario: permite identificar de forma única a cada usuario.</w:t>
       </w:r>
     </w:p>
     <w:p>
@@ -1359,56 +1327,24 @@
           <w:sz w:val="24"/>
           <w:szCs w:val="24"/>
         </w:rPr>
-        <w:t xml:space="preserve">● </w:t>
-      </w:r>
-      <w:proofErr w:type="spellStart"/>
-      <w:r>
-        <w:rPr>
-          <w:sz w:val="24"/>
-          <w:szCs w:val="24"/>
-        </w:rPr>
-        <w:t>Foto_perfil</w:t>
-      </w:r>
-      <w:proofErr w:type="spellEnd"/>
-      <w:r>
-        <w:rPr>
-          <w:sz w:val="24"/>
-          <w:szCs w:val="24"/>
-        </w:rPr>
-        <w:t>: permite agregar una imagen al perfil.</w:t>
-      </w:r>
-    </w:p>
-    <w:p>
-      <w:pPr>
-        <w:spacing w:line="331" w:lineRule="auto"/>
-        <w:ind w:left="800" w:hanging="260"/>
-        <w:rPr>
-          <w:sz w:val="24"/>
-          <w:szCs w:val="24"/>
-        </w:rPr>
-      </w:pPr>
-      <w:r>
-        <w:rPr>
-          <w:sz w:val="24"/>
-          <w:szCs w:val="24"/>
-        </w:rPr>
-        <w:t xml:space="preserve">● </w:t>
-      </w:r>
-      <w:proofErr w:type="spellStart"/>
-      <w:r>
-        <w:rPr>
-          <w:sz w:val="24"/>
-          <w:szCs w:val="24"/>
-        </w:rPr>
-        <w:t>Área_estudio</w:t>
-      </w:r>
-      <w:proofErr w:type="spellEnd"/>
-      <w:r>
-        <w:rPr>
-          <w:sz w:val="24"/>
-          <w:szCs w:val="24"/>
-        </w:rPr>
-        <w:t>: permite identificar el programa o área académica del estudiante.</w:t>
+        <w:t>● Foto_perfil: permite agregar una imagen al perfil.</w:t>
+      </w:r>
+    </w:p>
+    <w:p>
+      <w:pPr>
+        <w:spacing w:line="331" w:lineRule="auto"/>
+        <w:ind w:left="800" w:hanging="260"/>
+        <w:rPr>
+          <w:sz w:val="24"/>
+          <w:szCs w:val="24"/>
+        </w:rPr>
+      </w:pPr>
+      <w:r>
+        <w:rPr>
+          <w:sz w:val="24"/>
+          <w:szCs w:val="24"/>
+        </w:rPr>
+        <w:t>● Área_estudio: permite identificar el programa o área académica del estudiante.</w:t>
       </w:r>
     </w:p>
     <w:p>
@@ -1509,23 +1445,7 @@
           <w:sz w:val="24"/>
           <w:szCs w:val="24"/>
         </w:rPr>
-        <w:t xml:space="preserve">● </w:t>
-      </w:r>
-      <w:proofErr w:type="spellStart"/>
-      <w:r>
-        <w:rPr>
-          <w:sz w:val="24"/>
-          <w:szCs w:val="24"/>
-        </w:rPr>
-        <w:t>Id_publicacion</w:t>
-      </w:r>
-      <w:proofErr w:type="spellEnd"/>
-      <w:r>
-        <w:rPr>
-          <w:sz w:val="24"/>
-          <w:szCs w:val="24"/>
-        </w:rPr>
-        <w:t>: permite identificar cada publicación.</w:t>
+        <w:t>● Id_publicacion: permite identificar cada publicación.</w:t>
       </w:r>
     </w:p>
     <w:p>
@@ -1559,56 +1479,24 @@
           <w:sz w:val="24"/>
           <w:szCs w:val="24"/>
         </w:rPr>
-        <w:t xml:space="preserve">● </w:t>
-      </w:r>
-      <w:proofErr w:type="spellStart"/>
-      <w:r>
-        <w:rPr>
-          <w:sz w:val="24"/>
-          <w:szCs w:val="24"/>
-        </w:rPr>
-        <w:t>Fecha_hora</w:t>
-      </w:r>
-      <w:proofErr w:type="spellEnd"/>
-      <w:r>
-        <w:rPr>
-          <w:sz w:val="24"/>
-          <w:szCs w:val="24"/>
-        </w:rPr>
-        <w:t>: indica cuándo se realizó.</w:t>
-      </w:r>
-    </w:p>
-    <w:p>
-      <w:pPr>
-        <w:spacing w:line="331" w:lineRule="auto"/>
-        <w:ind w:left="800" w:hanging="260"/>
-        <w:rPr>
-          <w:sz w:val="24"/>
-          <w:szCs w:val="24"/>
-        </w:rPr>
-      </w:pPr>
-      <w:r>
-        <w:rPr>
-          <w:sz w:val="24"/>
-          <w:szCs w:val="24"/>
-        </w:rPr>
-        <w:t xml:space="preserve">● </w:t>
-      </w:r>
-      <w:proofErr w:type="spellStart"/>
-      <w:r>
-        <w:rPr>
-          <w:sz w:val="24"/>
-          <w:szCs w:val="24"/>
-        </w:rPr>
-        <w:t>Tipo_publicacion</w:t>
-      </w:r>
-      <w:proofErr w:type="spellEnd"/>
-      <w:r>
-        <w:rPr>
-          <w:sz w:val="24"/>
-          <w:szCs w:val="24"/>
-        </w:rPr>
-        <w:t>: permite diferenciar si se trata de una pregunta, recurso, noticia u otro contenido.</w:t>
+        <w:t>● Fecha_hora: indica cuándo se realizó.</w:t>
+      </w:r>
+    </w:p>
+    <w:p>
+      <w:pPr>
+        <w:spacing w:line="331" w:lineRule="auto"/>
+        <w:ind w:left="800" w:hanging="260"/>
+        <w:rPr>
+          <w:sz w:val="24"/>
+          <w:szCs w:val="24"/>
+        </w:rPr>
+      </w:pPr>
+      <w:r>
+        <w:rPr>
+          <w:sz w:val="24"/>
+          <w:szCs w:val="24"/>
+        </w:rPr>
+        <w:t>● Tipo_publicacion: permite diferenciar si se trata de una pregunta, recurso, noticia u otro contenido.</w:t>
       </w:r>
     </w:p>
     <w:p>
@@ -1675,23 +1563,7 @@
           <w:sz w:val="24"/>
           <w:szCs w:val="24"/>
         </w:rPr>
-        <w:t xml:space="preserve">● </w:t>
-      </w:r>
-      <w:proofErr w:type="spellStart"/>
-      <w:r>
-        <w:rPr>
-          <w:sz w:val="24"/>
-          <w:szCs w:val="24"/>
-        </w:rPr>
-        <w:t>Id_grupo</w:t>
-      </w:r>
-      <w:proofErr w:type="spellEnd"/>
-      <w:r>
-        <w:rPr>
-          <w:sz w:val="24"/>
-          <w:szCs w:val="24"/>
-        </w:rPr>
-        <w:t>: identifica de forma única cada grupo.</w:t>
+        <w:t>● Id_grupo: identifica de forma única cada grupo.</w:t>
       </w:r>
     </w:p>
     <w:p>
@@ -1743,39 +1615,7 @@
           <w:sz w:val="24"/>
           <w:szCs w:val="24"/>
         </w:rPr>
-        <w:t xml:space="preserve">● </w:t>
-      </w:r>
-      <w:proofErr w:type="spellStart"/>
-      <w:r>
-        <w:rPr>
-          <w:sz w:val="24"/>
-          <w:szCs w:val="24"/>
-        </w:rPr>
-        <w:t>Tipo_grupo</w:t>
-      </w:r>
-      <w:proofErr w:type="spellEnd"/>
-      <w:r>
-        <w:rPr>
-          <w:sz w:val="24"/>
-          <w:szCs w:val="24"/>
-        </w:rPr>
-        <w:t xml:space="preserve">: permite diferenciar entre grupos de estudio, clubes, equipos para </w:t>
-      </w:r>
-      <w:proofErr w:type="spellStart"/>
-      <w:r>
-        <w:rPr>
-          <w:sz w:val="24"/>
-          <w:szCs w:val="24"/>
-        </w:rPr>
-        <w:t>hackatones</w:t>
-      </w:r>
-      <w:proofErr w:type="spellEnd"/>
-      <w:r>
-        <w:rPr>
-          <w:sz w:val="24"/>
-          <w:szCs w:val="24"/>
-        </w:rPr>
-        <w:t>, entre otros.</w:t>
+        <w:t>● Tipo_grupo: permite diferenciar entre grupos de estudio, clubes, equipos para hackatones, entre otros.</w:t>
       </w:r>
     </w:p>
     <w:p>
@@ -1809,23 +1649,7 @@
           <w:sz w:val="24"/>
           <w:szCs w:val="24"/>
         </w:rPr>
-        <w:t xml:space="preserve">● </w:t>
-      </w:r>
-      <w:proofErr w:type="spellStart"/>
-      <w:r>
-        <w:rPr>
-          <w:sz w:val="24"/>
-          <w:szCs w:val="24"/>
-        </w:rPr>
-        <w:t>Fecha_creacion</w:t>
-      </w:r>
-      <w:proofErr w:type="spellEnd"/>
-      <w:r>
-        <w:rPr>
-          <w:sz w:val="24"/>
-          <w:szCs w:val="24"/>
-        </w:rPr>
-        <w:t>: permite conocer cuándo se creó el grupo.</w:t>
+        <w:t>● Fecha_creacion: permite conocer cuándo se creó el grupo.</w:t>
       </w:r>
     </w:p>
     <w:p>
@@ -1892,23 +1716,7 @@
           <w:sz w:val="24"/>
           <w:szCs w:val="24"/>
         </w:rPr>
-        <w:t xml:space="preserve">● </w:t>
-      </w:r>
-      <w:proofErr w:type="spellStart"/>
-      <w:r>
-        <w:rPr>
-          <w:sz w:val="24"/>
-          <w:szCs w:val="24"/>
-        </w:rPr>
-        <w:t>Id_evento</w:t>
-      </w:r>
-      <w:proofErr w:type="spellEnd"/>
-      <w:r>
-        <w:rPr>
-          <w:sz w:val="24"/>
-          <w:szCs w:val="24"/>
-        </w:rPr>
-        <w:t>: identifica cada evento.</w:t>
+        <w:t>● Id_evento: identifica cada evento.</w:t>
       </w:r>
     </w:p>
     <w:p>
@@ -2010,23 +1818,7 @@
           <w:sz w:val="24"/>
           <w:szCs w:val="24"/>
         </w:rPr>
-        <w:t xml:space="preserve">● </w:t>
-      </w:r>
-      <w:proofErr w:type="spellStart"/>
-      <w:r>
-        <w:rPr>
-          <w:sz w:val="24"/>
-          <w:szCs w:val="24"/>
-        </w:rPr>
-        <w:t>Tipo_evento</w:t>
-      </w:r>
-      <w:proofErr w:type="spellEnd"/>
-      <w:r>
-        <w:rPr>
-          <w:sz w:val="24"/>
-          <w:szCs w:val="24"/>
-        </w:rPr>
-        <w:t>: permite diferenciar entre talleres, reuniones de estudio, actividades sociales, entre otros.</w:t>
+        <w:t>● Tipo_evento: permite diferenciar entre talleres, reuniones de estudio, actividades sociales, entre otros.</w:t>
       </w:r>
     </w:p>
     <w:p>
@@ -2093,89 +1885,41 @@
           <w:sz w:val="24"/>
           <w:szCs w:val="24"/>
         </w:rPr>
-        <w:t xml:space="preserve">● </w:t>
-      </w:r>
-      <w:proofErr w:type="spellStart"/>
-      <w:r>
-        <w:rPr>
-          <w:sz w:val="24"/>
-          <w:szCs w:val="24"/>
-        </w:rPr>
-        <w:t>Id_chat</w:t>
-      </w:r>
-      <w:proofErr w:type="spellEnd"/>
-      <w:r>
-        <w:rPr>
-          <w:sz w:val="24"/>
-          <w:szCs w:val="24"/>
-        </w:rPr>
-        <w:t>: identifica de forma única cada conversación.</w:t>
-      </w:r>
-    </w:p>
-    <w:p>
-      <w:pPr>
-        <w:spacing w:line="331" w:lineRule="auto"/>
-        <w:ind w:left="800" w:hanging="260"/>
-        <w:rPr>
-          <w:sz w:val="24"/>
-          <w:szCs w:val="24"/>
-        </w:rPr>
-      </w:pPr>
-      <w:r>
-        <w:rPr>
-          <w:sz w:val="24"/>
-          <w:szCs w:val="24"/>
-        </w:rPr>
-        <w:t xml:space="preserve">● </w:t>
-      </w:r>
-      <w:proofErr w:type="spellStart"/>
-      <w:r>
-        <w:rPr>
-          <w:sz w:val="24"/>
-          <w:szCs w:val="24"/>
-        </w:rPr>
-        <w:t>Fecha_creacion</w:t>
-      </w:r>
-      <w:proofErr w:type="spellEnd"/>
-      <w:r>
-        <w:rPr>
-          <w:sz w:val="24"/>
-          <w:szCs w:val="24"/>
-        </w:rPr>
-        <w:t>: indica cuándo se creó el chat.</w:t>
-      </w:r>
-    </w:p>
-    <w:p>
-      <w:pPr>
-        <w:spacing w:line="331" w:lineRule="auto"/>
-        <w:ind w:left="800" w:hanging="260"/>
-        <w:rPr>
-          <w:sz w:val="24"/>
-          <w:szCs w:val="24"/>
-        </w:rPr>
-      </w:pPr>
-      <w:r>
-        <w:rPr>
-          <w:sz w:val="24"/>
-          <w:szCs w:val="24"/>
-        </w:rPr>
-        <w:t xml:space="preserve">● </w:t>
-      </w:r>
-      <w:proofErr w:type="spellStart"/>
-      <w:r>
-        <w:rPr>
-          <w:sz w:val="24"/>
-          <w:szCs w:val="24"/>
-        </w:rPr>
-        <w:t>Tipo_chat</w:t>
-      </w:r>
-      <w:proofErr w:type="spellEnd"/>
-      <w:r>
-        <w:rPr>
-          <w:sz w:val="24"/>
-          <w:szCs w:val="24"/>
-        </w:rPr>
-        <w:t>: permite identificar si se trata de un chat privado o grupal.</w:t>
+        <w:t>● Id_chat: identifica de forma única cada conversación.</w:t>
+      </w:r>
+    </w:p>
+    <w:p>
+      <w:pPr>
+        <w:spacing w:line="331" w:lineRule="auto"/>
+        <w:ind w:left="800" w:hanging="260"/>
+        <w:rPr>
+          <w:sz w:val="24"/>
+          <w:szCs w:val="24"/>
+        </w:rPr>
+      </w:pPr>
+      <w:r>
+        <w:rPr>
+          <w:sz w:val="24"/>
+          <w:szCs w:val="24"/>
+        </w:rPr>
+        <w:t>● Fecha_creacion: indica cuándo se creó el chat.</w:t>
+      </w:r>
+    </w:p>
+    <w:p>
+      <w:pPr>
+        <w:spacing w:line="331" w:lineRule="auto"/>
+        <w:ind w:left="800" w:hanging="260"/>
+        <w:rPr>
+          <w:sz w:val="24"/>
+          <w:szCs w:val="24"/>
+        </w:rPr>
+      </w:pPr>
+      <w:r>
+        <w:rPr>
+          <w:sz w:val="24"/>
+          <w:szCs w:val="24"/>
+        </w:rPr>
+        <w:t>● Tipo_chat: permite identificar si se trata de un chat privado o grupal.</w:t>
       </w:r>
     </w:p>
     <w:p>
@@ -2242,23 +1986,7 @@
           <w:sz w:val="24"/>
           <w:szCs w:val="24"/>
         </w:rPr>
-        <w:t xml:space="preserve">● </w:t>
-      </w:r>
-      <w:proofErr w:type="spellStart"/>
-      <w:r>
-        <w:rPr>
-          <w:sz w:val="24"/>
-          <w:szCs w:val="24"/>
-        </w:rPr>
-        <w:t>Id_mensaje</w:t>
-      </w:r>
-      <w:proofErr w:type="spellEnd"/>
-      <w:r>
-        <w:rPr>
-          <w:sz w:val="24"/>
-          <w:szCs w:val="24"/>
-        </w:rPr>
-        <w:t>: identifica cada mensaje.</w:t>
+        <w:t>● Id_mensaje: identifica cada mensaje.</w:t>
       </w:r>
     </w:p>
     <w:p>
@@ -2292,23 +2020,7 @@
           <w:sz w:val="24"/>
           <w:szCs w:val="24"/>
         </w:rPr>
-        <w:t xml:space="preserve">● </w:t>
-      </w:r>
-      <w:proofErr w:type="spellStart"/>
-      <w:r>
-        <w:rPr>
-          <w:sz w:val="24"/>
-          <w:szCs w:val="24"/>
-        </w:rPr>
-        <w:t>Fecha_hora</w:t>
-      </w:r>
-      <w:proofErr w:type="spellEnd"/>
-      <w:r>
-        <w:rPr>
-          <w:sz w:val="24"/>
-          <w:szCs w:val="24"/>
-        </w:rPr>
-        <w:t>: permite saber cuándo se envió.</w:t>
+        <w:t>● Fecha_hora: permite saber cuándo se envió.</w:t>
       </w:r>
     </w:p>
     <w:p>
@@ -2393,23 +2105,7 @@
           <w:sz w:val="24"/>
           <w:szCs w:val="24"/>
         </w:rPr>
-        <w:t xml:space="preserve">● </w:t>
-      </w:r>
-      <w:proofErr w:type="spellStart"/>
-      <w:r>
-        <w:rPr>
-          <w:sz w:val="24"/>
-          <w:szCs w:val="24"/>
-        </w:rPr>
-        <w:t>Id_archivo</w:t>
-      </w:r>
-      <w:proofErr w:type="spellEnd"/>
-      <w:r>
-        <w:rPr>
-          <w:sz w:val="24"/>
-          <w:szCs w:val="24"/>
-        </w:rPr>
-        <w:t>: permite identificar cada archivo.</w:t>
+        <w:t>● Id_archivo: permite identificar cada archivo.</w:t>
       </w:r>
     </w:p>
     <w:p>
@@ -2544,56 +2240,24 @@
           <w:sz w:val="24"/>
           <w:szCs w:val="24"/>
         </w:rPr>
-        <w:t xml:space="preserve">● </w:t>
-      </w:r>
-      <w:proofErr w:type="spellStart"/>
-      <w:r>
-        <w:rPr>
-          <w:sz w:val="24"/>
-          <w:szCs w:val="24"/>
-        </w:rPr>
-        <w:t>Id_conexion</w:t>
-      </w:r>
-      <w:proofErr w:type="spellEnd"/>
-      <w:r>
-        <w:rPr>
-          <w:sz w:val="24"/>
-          <w:szCs w:val="24"/>
-        </w:rPr>
-        <w:t>: identifica de forma única cada conexión.</w:t>
-      </w:r>
-    </w:p>
-    <w:p>
-      <w:pPr>
-        <w:spacing w:line="331" w:lineRule="auto"/>
-        <w:ind w:left="800" w:hanging="260"/>
-        <w:rPr>
-          <w:sz w:val="24"/>
-          <w:szCs w:val="24"/>
-        </w:rPr>
-      </w:pPr>
-      <w:r>
-        <w:rPr>
-          <w:sz w:val="24"/>
-          <w:szCs w:val="24"/>
-        </w:rPr>
-        <w:t xml:space="preserve">● </w:t>
-      </w:r>
-      <w:proofErr w:type="spellStart"/>
-      <w:r>
-        <w:rPr>
-          <w:sz w:val="24"/>
-          <w:szCs w:val="24"/>
-        </w:rPr>
-        <w:t>Fecha_solicitud</w:t>
-      </w:r>
-      <w:proofErr w:type="spellEnd"/>
-      <w:r>
-        <w:rPr>
-          <w:sz w:val="24"/>
-          <w:szCs w:val="24"/>
-        </w:rPr>
-        <w:t>: registra cuándo el solicitante envió la solicitud al receptor.</w:t>
+        <w:t>● Id_conexion: identifica de forma única cada conexión.</w:t>
+      </w:r>
+    </w:p>
+    <w:p>
+      <w:pPr>
+        <w:spacing w:line="331" w:lineRule="auto"/>
+        <w:ind w:left="800" w:hanging="260"/>
+        <w:rPr>
+          <w:sz w:val="24"/>
+          <w:szCs w:val="24"/>
+        </w:rPr>
+      </w:pPr>
+      <w:r>
+        <w:rPr>
+          <w:sz w:val="24"/>
+          <w:szCs w:val="24"/>
+        </w:rPr>
+        <w:t>● Fecha_solicitud: registra cuándo el solicitante envió la solicitud al receptor.</w:t>
       </w:r>
     </w:p>
     <w:p>
@@ -2627,23 +2291,7 @@
           <w:sz w:val="24"/>
           <w:szCs w:val="24"/>
         </w:rPr>
-        <w:t xml:space="preserve">● </w:t>
-      </w:r>
-      <w:proofErr w:type="spellStart"/>
-      <w:r>
-        <w:rPr>
-          <w:sz w:val="24"/>
-          <w:szCs w:val="24"/>
-        </w:rPr>
-        <w:t>Fecha_conexion</w:t>
-      </w:r>
-      <w:proofErr w:type="spellEnd"/>
-      <w:r>
-        <w:rPr>
-          <w:sz w:val="24"/>
-          <w:szCs w:val="24"/>
-        </w:rPr>
-        <w:t>: registra cuándo se aceptó la solicitud; no tiene valor mientras esté pendiente o rechazada.</w:t>
+        <w:t>● Fecha_conexion: registra cuándo se aceptó la solicitud; no tiene valor mientras esté pendiente o rechazada.</w:t>
       </w:r>
     </w:p>
     <w:p>
@@ -2754,17 +2402,8 @@
           <w:szCs w:val="24"/>
         </w:rPr>
         <w:br/>
-        <w:t xml:space="preserve">Cardinalidad: </w:t>
-      </w:r>
-      <w:proofErr w:type="gramStart"/>
-      <w:r>
-        <w:rPr>
-          <w:sz w:val="24"/>
-          <w:szCs w:val="24"/>
-        </w:rPr>
-        <w:t>1:N</w:t>
-      </w:r>
-      <w:proofErr w:type="gramEnd"/>
+        <w:t>Cardinalidad: 1:N</w:t>
+      </w:r>
     </w:p>
     <w:p>
       <w:pPr>
@@ -2830,23 +2469,7 @@
           <w:sz w:val="24"/>
           <w:szCs w:val="24"/>
         </w:rPr>
-        <w:t xml:space="preserve">Relaciones: SOLICITA y RECIBE | Cardinalidad: </w:t>
-      </w:r>
-      <w:proofErr w:type="gramStart"/>
-      <w:r>
-        <w:rPr>
-          <w:sz w:val="24"/>
-          <w:szCs w:val="24"/>
-        </w:rPr>
-        <w:t>1:N</w:t>
-      </w:r>
-      <w:proofErr w:type="gramEnd"/>
-      <w:r>
-        <w:rPr>
-          <w:sz w:val="24"/>
-          <w:szCs w:val="24"/>
-        </w:rPr>
-        <w:t xml:space="preserve"> en cada relación.</w:t>
+        <w:t>Relaciones: SOLICITA y RECIBE | Cardinalidad: 1:N en cada relación.</w:t>
       </w:r>
     </w:p>
     <w:p>
@@ -2947,17 +2570,8 @@
           <w:sz w:val="24"/>
           <w:szCs w:val="24"/>
         </w:rPr>
-        <w:t xml:space="preserve">Cardinalidad: </w:t>
-      </w:r>
-      <w:proofErr w:type="gramStart"/>
-      <w:r>
-        <w:rPr>
-          <w:sz w:val="24"/>
-          <w:szCs w:val="24"/>
-        </w:rPr>
-        <w:t>1:N</w:t>
-      </w:r>
-      <w:proofErr w:type="gramEnd"/>
+        <w:t>Cardinalidad: 1:N</w:t>
+      </w:r>
     </w:p>
     <w:p>
       <w:pPr>
@@ -3024,17 +2638,8 @@
           <w:sz w:val="24"/>
           <w:szCs w:val="24"/>
         </w:rPr>
-        <w:t xml:space="preserve">Cardinalidad: </w:t>
-      </w:r>
-      <w:proofErr w:type="gramStart"/>
-      <w:r>
-        <w:rPr>
-          <w:sz w:val="24"/>
-          <w:szCs w:val="24"/>
-        </w:rPr>
-        <w:t>M:N</w:t>
-      </w:r>
-      <w:proofErr w:type="gramEnd"/>
+        <w:t>Cardinalidad: M:N</w:t>
+      </w:r>
     </w:p>
     <w:p>
       <w:pPr>
@@ -3065,23 +2670,7 @@
           <w:sz w:val="24"/>
           <w:szCs w:val="24"/>
         </w:rPr>
-        <w:t xml:space="preserve">Esta relación permite representar la participación de los estudiantes en grupos de estudio, clubes, </w:t>
-      </w:r>
-      <w:proofErr w:type="spellStart"/>
-      <w:r>
-        <w:rPr>
-          <w:sz w:val="24"/>
-          <w:szCs w:val="24"/>
-        </w:rPr>
-        <w:t>hackatones</w:t>
-      </w:r>
-      <w:proofErr w:type="spellEnd"/>
-      <w:r>
-        <w:rPr>
-          <w:sz w:val="24"/>
-          <w:szCs w:val="24"/>
-        </w:rPr>
-        <w:t xml:space="preserve"> u otras actividades.</w:t>
+        <w:t>Esta relación permite representar la participación de los estudiantes en grupos de estudio, clubes, hackatones u otras actividades.</w:t>
       </w:r>
     </w:p>
     <w:p>
@@ -3150,17 +2739,8 @@
           <w:sz w:val="24"/>
           <w:szCs w:val="24"/>
         </w:rPr>
-        <w:t xml:space="preserve">Cardinalidad: </w:t>
-      </w:r>
-      <w:proofErr w:type="gramStart"/>
-      <w:r>
-        <w:rPr>
-          <w:sz w:val="24"/>
-          <w:szCs w:val="24"/>
-        </w:rPr>
-        <w:t>1:N</w:t>
-      </w:r>
-      <w:proofErr w:type="gramEnd"/>
+        <w:t>Cardinalidad: 1:N</w:t>
+      </w:r>
     </w:p>
     <w:p>
       <w:pPr>
@@ -3228,17 +2808,8 @@
           <w:sz w:val="24"/>
           <w:szCs w:val="24"/>
         </w:rPr>
-        <w:t xml:space="preserve">Cardinalidad: </w:t>
-      </w:r>
-      <w:proofErr w:type="gramStart"/>
-      <w:r>
-        <w:rPr>
-          <w:sz w:val="24"/>
-          <w:szCs w:val="24"/>
-        </w:rPr>
-        <w:t>M:N</w:t>
-      </w:r>
-      <w:proofErr w:type="gramEnd"/>
+        <w:t>Cardinalidad: M:N</w:t>
+      </w:r>
     </w:p>
     <w:p>
       <w:pPr>
@@ -3303,17 +2874,8 @@
           <w:sz w:val="24"/>
           <w:szCs w:val="24"/>
         </w:rPr>
-        <w:t xml:space="preserve">Relación: PARTICIPA_EN | Cardinalidad: </w:t>
-      </w:r>
-      <w:proofErr w:type="gramStart"/>
-      <w:r>
-        <w:rPr>
-          <w:sz w:val="24"/>
-          <w:szCs w:val="24"/>
-        </w:rPr>
-        <w:t>M:N</w:t>
-      </w:r>
-      <w:proofErr w:type="gramEnd"/>
+        <w:t>Relación: PARTICIPA_EN | Cardinalidad: M:N</w:t>
+      </w:r>
     </w:p>
     <w:p>
       <w:pPr>
@@ -3386,17 +2948,8 @@
           <w:szCs w:val="24"/>
         </w:rPr>
         <w:br/>
-        <w:t xml:space="preserve">Cardinalidad: </w:t>
-      </w:r>
-      <w:proofErr w:type="gramStart"/>
-      <w:r>
-        <w:rPr>
-          <w:sz w:val="24"/>
-          <w:szCs w:val="24"/>
-        </w:rPr>
-        <w:t>1:N</w:t>
-      </w:r>
-      <w:proofErr w:type="gramEnd"/>
+        <w:t>Cardinalidad: 1:N</w:t>
+      </w:r>
     </w:p>
     <w:p>
       <w:pPr>
@@ -3469,17 +3022,8 @@
           <w:szCs w:val="24"/>
         </w:rPr>
         <w:br/>
-        <w:t xml:space="preserve">Cardinalidad: </w:t>
-      </w:r>
-      <w:proofErr w:type="gramStart"/>
-      <w:r>
-        <w:rPr>
-          <w:sz w:val="24"/>
-          <w:szCs w:val="24"/>
-        </w:rPr>
-        <w:t>1:N</w:t>
-      </w:r>
-      <w:proofErr w:type="gramEnd"/>
+        <w:t>Cardinalidad: 1:N</w:t>
+      </w:r>
     </w:p>
     <w:p>
       <w:pPr>
@@ -3552,64 +3096,23 @@
           <w:szCs w:val="24"/>
         </w:rPr>
         <w:br/>
-        <w:t xml:space="preserve">Cardinalidad: </w:t>
-      </w:r>
-      <w:proofErr w:type="gramStart"/>
-      <w:r>
-        <w:rPr>
-          <w:sz w:val="24"/>
-          <w:szCs w:val="24"/>
-        </w:rPr>
-        <w:t>1:N</w:t>
-      </w:r>
-      <w:proofErr w:type="gramEnd"/>
-    </w:p>
-    <w:p>
-      <w:pPr>
-        <w:spacing w:line="331" w:lineRule="auto"/>
-        <w:rPr>
-          <w:sz w:val="24"/>
-          <w:szCs w:val="24"/>
-        </w:rPr>
-      </w:pPr>
-      <w:r>
-        <w:rPr>
-          <w:sz w:val="24"/>
-          <w:szCs w:val="24"/>
-        </w:rPr>
-        <w:t>Un mensaje puede tener entre cero y muchos archivos adjuntos (</w:t>
-      </w:r>
-      <w:proofErr w:type="gramStart"/>
-      <w:r>
-        <w:rPr>
-          <w:sz w:val="24"/>
-          <w:szCs w:val="24"/>
-        </w:rPr>
-        <w:t>0..</w:t>
-      </w:r>
-      <w:proofErr w:type="gramEnd"/>
-      <w:r>
-        <w:rPr>
-          <w:sz w:val="24"/>
-          <w:szCs w:val="24"/>
-        </w:rPr>
-        <w:t xml:space="preserve">N), mientras que cada archivo pertenece a un único mensaje (1..1). La relación es </w:t>
-      </w:r>
-      <w:proofErr w:type="gramStart"/>
-      <w:r>
-        <w:rPr>
-          <w:sz w:val="24"/>
-          <w:szCs w:val="24"/>
-        </w:rPr>
-        <w:t>1:N</w:t>
-      </w:r>
-      <w:proofErr w:type="gramEnd"/>
-      <w:r>
-        <w:rPr>
-          <w:sz w:val="24"/>
-          <w:szCs w:val="24"/>
-        </w:rPr>
-        <w:t xml:space="preserve"> y la participación del mensaje es opcional: también se pueden enviar mensajes sin archivos.</w:t>
+        <w:t>Cardinalidad: 1:N</w:t>
+      </w:r>
+    </w:p>
+    <w:p>
+      <w:pPr>
+        <w:spacing w:line="331" w:lineRule="auto"/>
+        <w:rPr>
+          <w:sz w:val="24"/>
+          <w:szCs w:val="24"/>
+        </w:rPr>
+      </w:pPr>
+      <w:r>
+        <w:rPr>
+          <w:sz w:val="24"/>
+          <w:szCs w:val="24"/>
+        </w:rPr>
+        <w:t>Un mensaje puede tener entre cero y muchos archivos adjuntos (0..N), mientras que cada archivo pertenece a un único mensaje (1..1). La relación es 1:N y la participación del mensaje es opcional: también se pueden enviar mensajes sin archivos.</w:t>
       </w:r>
     </w:p>
     <w:p>
@@ -3660,17 +3163,8 @@
           <w:sz w:val="24"/>
           <w:szCs w:val="24"/>
         </w:rPr>
-        <w:t xml:space="preserve">Relación: SIGUE | Cardinalidad: </w:t>
-      </w:r>
-      <w:proofErr w:type="gramStart"/>
-      <w:r>
-        <w:rPr>
-          <w:sz w:val="24"/>
-          <w:szCs w:val="24"/>
-        </w:rPr>
-        <w:t>M:N.</w:t>
-      </w:r>
-      <w:proofErr w:type="gramEnd"/>
+        <w:t>Relación: SIGUE | Cardinalidad: M:N.</w:t>
+      </w:r>
     </w:p>
     <w:p>
       <w:pPr>
@@ -3712,21 +3206,12 @@
           <w:szCs w:val="24"/>
         </w:rPr>
       </w:pPr>
-      <w:proofErr w:type="spellStart"/>
-      <w:r>
-        <w:rPr>
-          <w:sz w:val="24"/>
-          <w:szCs w:val="24"/>
-        </w:rPr>
-        <w:t>Fecha_seguimiento</w:t>
-      </w:r>
-      <w:proofErr w:type="spellEnd"/>
-      <w:r>
-        <w:rPr>
-          <w:sz w:val="24"/>
-          <w:szCs w:val="24"/>
-        </w:rPr>
-        <w:t>: registra cuándo comenzó el seguimiento y pertenece a la relación, porque depende del par de usuarios.</w:t>
+      <w:r>
+        <w:rPr>
+          <w:sz w:val="24"/>
+          <w:szCs w:val="24"/>
+        </w:rPr>
+        <w:t>Fecha_seguimiento: registra cuándo comenzó el seguimiento y pertenece a la relación, porque depende del par de usuarios.</w:t>
       </w:r>
     </w:p>
     <w:p>
@@ -3895,39 +3380,7 @@
           <w:sz w:val="24"/>
           <w:szCs w:val="24"/>
         </w:rPr>
-        <w:t xml:space="preserve">El diagrama contiene ocho entidades y doce relaciones. Las etiquetas </w:t>
-      </w:r>
-      <w:proofErr w:type="gramStart"/>
-      <w:r>
-        <w:rPr>
-          <w:sz w:val="24"/>
-          <w:szCs w:val="24"/>
-        </w:rPr>
-        <w:t>1:N</w:t>
-      </w:r>
-      <w:proofErr w:type="gramEnd"/>
-      <w:r>
-        <w:rPr>
-          <w:sz w:val="24"/>
-          <w:szCs w:val="24"/>
-        </w:rPr>
-        <w:t xml:space="preserve"> y M:N indican las cardinalidades máximas. SIGUE es una relación recursiva entre usuarios, con los roles seguidor y seguido; ambos admiten cero o muchas participaciones. Conexión conserva SOLICITA y RECIBE, ambas </w:t>
-      </w:r>
-      <w:proofErr w:type="gramStart"/>
-      <w:r>
-        <w:rPr>
-          <w:sz w:val="24"/>
-          <w:szCs w:val="24"/>
-        </w:rPr>
-        <w:t>1:N.</w:t>
-      </w:r>
-      <w:proofErr w:type="gramEnd"/>
-      <w:r>
-        <w:rPr>
-          <w:sz w:val="24"/>
-          <w:szCs w:val="24"/>
-        </w:rPr>
-        <w:t xml:space="preserve"> Los nombres de atributos se muestran en minúsculas y sin tildes.</w:t>
+        <w:t>El diagrama contiene ocho entidades y doce relaciones. Las etiquetas 1:N y M:N indican las cardinalidades máximas. SIGUE es una relación recursiva entre usuarios, con los roles seguidor y seguido; ambos admiten cero o muchas participaciones. Conexión conserva SOLICITA y RECIBE, ambas 1:N. Los nombres de atributos se muestran en minúsculas y sin tildes.</w:t>
       </w:r>
     </w:p>
     <w:p>
@@ -4258,23 +3711,7 @@
           <w:sz w:val="24"/>
           <w:szCs w:val="24"/>
         </w:rPr>
-        <w:t xml:space="preserve">Se identificaron varias relaciones </w:t>
-      </w:r>
-      <w:proofErr w:type="gramStart"/>
-      <w:r>
-        <w:rPr>
-          <w:sz w:val="24"/>
-          <w:szCs w:val="24"/>
-        </w:rPr>
-        <w:t>M:N</w:t>
-      </w:r>
-      <w:proofErr w:type="gramEnd"/>
-      <w:r>
-        <w:rPr>
-          <w:sz w:val="24"/>
-          <w:szCs w:val="24"/>
-        </w:rPr>
-        <w:t>:</w:t>
+        <w:t>Se identificaron varias relaciones M:N:</w:t>
       </w:r>
     </w:p>
     <w:p>
@@ -4425,89 +3862,41 @@
           <w:sz w:val="24"/>
           <w:szCs w:val="24"/>
         </w:rPr>
-        <w:t xml:space="preserve">● </w:t>
-      </w:r>
-      <w:proofErr w:type="spellStart"/>
-      <w:r>
-        <w:rPr>
-          <w:sz w:val="24"/>
-          <w:szCs w:val="24"/>
-        </w:rPr>
-        <w:t>Fecha_union</w:t>
-      </w:r>
-      <w:proofErr w:type="spellEnd"/>
-      <w:r>
-        <w:rPr>
-          <w:sz w:val="24"/>
-          <w:szCs w:val="24"/>
-        </w:rPr>
-        <w:t xml:space="preserve"> y Rol en PERTENECE (Usuario–Grupo): registran la fecha de ingreso y el rol del usuario dentro del grupo.</w:t>
-      </w:r>
-    </w:p>
-    <w:p>
-      <w:pPr>
-        <w:spacing w:line="331" w:lineRule="auto"/>
-        <w:ind w:left="800" w:hanging="260"/>
-        <w:rPr>
-          <w:sz w:val="24"/>
-          <w:szCs w:val="24"/>
-        </w:rPr>
-      </w:pPr>
-      <w:r>
-        <w:rPr>
-          <w:sz w:val="24"/>
-          <w:szCs w:val="24"/>
-        </w:rPr>
-        <w:t xml:space="preserve">● </w:t>
-      </w:r>
-      <w:proofErr w:type="spellStart"/>
-      <w:r>
-        <w:rPr>
-          <w:sz w:val="24"/>
-          <w:szCs w:val="24"/>
-        </w:rPr>
-        <w:t>Estado_participacion</w:t>
-      </w:r>
-      <w:proofErr w:type="spellEnd"/>
-      <w:r>
-        <w:rPr>
-          <w:sz w:val="24"/>
-          <w:szCs w:val="24"/>
-        </w:rPr>
-        <w:t xml:space="preserve"> en PARTICIPA (Usuario–Evento): registra el estado de participación del usuario en el evento.</w:t>
-      </w:r>
-    </w:p>
-    <w:p>
-      <w:pPr>
-        <w:spacing w:line="331" w:lineRule="auto"/>
-        <w:ind w:left="800" w:hanging="260"/>
-        <w:rPr>
-          <w:sz w:val="24"/>
-          <w:szCs w:val="24"/>
-        </w:rPr>
-      </w:pPr>
-      <w:r>
-        <w:rPr>
-          <w:sz w:val="24"/>
-          <w:szCs w:val="24"/>
-        </w:rPr>
-        <w:t xml:space="preserve">● </w:t>
-      </w:r>
-      <w:proofErr w:type="spellStart"/>
-      <w:r>
-        <w:rPr>
-          <w:sz w:val="24"/>
-          <w:szCs w:val="24"/>
-        </w:rPr>
-        <w:t>Fecha_seguimiento</w:t>
-      </w:r>
-      <w:proofErr w:type="spellEnd"/>
-      <w:r>
-        <w:rPr>
-          <w:sz w:val="24"/>
-          <w:szCs w:val="24"/>
-        </w:rPr>
-        <w:t xml:space="preserve"> en SIGUE (Usuario–Usuario): registra el inicio del seguimiento entre el seguidor y el seguido.</w:t>
+        <w:t>● Fecha_union y Rol en PERTENECE (Usuario–Grupo): registran la fecha de ingreso y el rol del usuario dentro del grupo.</w:t>
+      </w:r>
+    </w:p>
+    <w:p>
+      <w:pPr>
+        <w:spacing w:line="331" w:lineRule="auto"/>
+        <w:ind w:left="800" w:hanging="260"/>
+        <w:rPr>
+          <w:sz w:val="24"/>
+          <w:szCs w:val="24"/>
+        </w:rPr>
+      </w:pPr>
+      <w:r>
+        <w:rPr>
+          <w:sz w:val="24"/>
+          <w:szCs w:val="24"/>
+        </w:rPr>
+        <w:t>● Estado_participacion en PARTICIPA (Usuario–Evento): registra el estado de participación del usuario en el evento.</w:t>
+      </w:r>
+    </w:p>
+    <w:p>
+      <w:pPr>
+        <w:spacing w:line="331" w:lineRule="auto"/>
+        <w:ind w:left="800" w:hanging="260"/>
+        <w:rPr>
+          <w:sz w:val="24"/>
+          <w:szCs w:val="24"/>
+        </w:rPr>
+      </w:pPr>
+      <w:r>
+        <w:rPr>
+          <w:sz w:val="24"/>
+          <w:szCs w:val="24"/>
+        </w:rPr>
+        <w:t>● Fecha_seguimiento en SIGUE (Usuario–Usuario): registra el inicio del seguimiento entre el seguidor y el seguido.</w:t>
       </w:r>
     </w:p>
     <w:p>
@@ -4910,21 +4299,7 @@
         <w:rPr>
           <w:rFonts w:ascii="Arial" w:hAnsi="Arial" w:cs="Arial"/>
         </w:rPr>
-        <w:t xml:space="preserve">El desarrollo de este proyecto me permitió comprender cómo transformar las necesidades generales de la Red Social Pascualina en una estructura de datos organizada. Comprendí que el Modelo Entidad </w:t>
-      </w:r>
-      <w:proofErr w:type="gramStart"/>
-      <w:r>
-        <w:rPr>
-          <w:rFonts w:ascii="Arial" w:hAnsi="Arial" w:cs="Arial"/>
-        </w:rPr>
-        <w:t>Relación  es</w:t>
-      </w:r>
-      <w:proofErr w:type="gramEnd"/>
-      <w:r>
-        <w:rPr>
-          <w:rFonts w:ascii="Arial" w:hAnsi="Arial" w:cs="Arial"/>
-        </w:rPr>
-        <w:t xml:space="preserve"> un paso fundamental para tener una visión clara del funcionamiento del sistema antes de avanzar hacia el modelo lógico y su posterior implementación.</w:t>
+        <w:t>El desarrollo de este proyecto me permitió comprender cómo transformar las necesidades generales de la Red Social Pascualina en una estructura de datos organizada. Comprendí que el Modelo Entidad Relación  es un paso fundamental para tener una visión clara del funcionamiento del sistema antes de avanzar hacia el modelo lógico y su posterior implementación.</w:t>
       </w:r>
     </w:p>
     <w:p>
@@ -5057,37 +4432,12 @@
           <w:szCs w:val="24"/>
         </w:rPr>
       </w:pPr>
-      <w:proofErr w:type="spellStart"/>
-      <w:r>
-        <w:rPr>
-          <w:sz w:val="24"/>
-          <w:szCs w:val="24"/>
-        </w:rPr>
-        <w:t>Elmasri</w:t>
-      </w:r>
-      <w:proofErr w:type="spellEnd"/>
-      <w:r>
-        <w:rPr>
-          <w:sz w:val="24"/>
-          <w:szCs w:val="24"/>
-        </w:rPr>
-        <w:t xml:space="preserve">, R., &amp; </w:t>
-      </w:r>
-      <w:proofErr w:type="spellStart"/>
-      <w:r>
-        <w:rPr>
-          <w:sz w:val="24"/>
-          <w:szCs w:val="24"/>
-        </w:rPr>
-        <w:t>Navathe</w:t>
-      </w:r>
-      <w:proofErr w:type="spellEnd"/>
-      <w:r>
-        <w:rPr>
-          <w:sz w:val="24"/>
-          <w:szCs w:val="24"/>
-        </w:rPr>
-        <w:t>, S. B. (2007). Fundamentos de sistemas de bases de datos (5.ª ed.). Pearson Educación.</w:t>
+      <w:r>
+        <w:rPr>
+          <w:sz w:val="24"/>
+          <w:szCs w:val="24"/>
+        </w:rPr>
+        <w:t>Elmasri, R., &amp; Navathe, S. B. (2007). Fundamentos de sistemas de bases de datos (5.ª ed.). Pearson Educación.</w:t>
       </w:r>
     </w:p>
     <w:p>
@@ -5145,6 +4495,107 @@
           <w:szCs w:val="24"/>
         </w:rPr>
       </w:pPr>
+    </w:p>
+    <w:p>
+      <w:pPr>
+        <w:pStyle w:val="Ttulo3"/>
+        <w:rPr>
+          <w:b/>
+          <w:bCs/>
+          <w:sz w:val="36"/>
+          <w:szCs w:val="36"/>
+        </w:rPr>
+      </w:pPr>
+      <w:r>
+        <w:rPr>
+          <w:b/>
+          <w:bCs/>
+          <w:sz w:val="36"/>
+          <w:szCs w:val="36"/>
+        </w:rPr>
+        <w:t>13</w:t>
+      </w:r>
+      <w:r>
+        <w:rPr>
+          <w:b/>
+          <w:bCs/>
+          <w:sz w:val="36"/>
+          <w:szCs w:val="36"/>
+        </w:rPr>
+        <w:t>.</w:t>
+      </w:r>
+      <w:r>
+        <w:rPr>
+          <w:b/>
+          <w:bCs/>
+          <w:sz w:val="36"/>
+          <w:szCs w:val="36"/>
+        </w:rPr>
+        <w:t>Conclusión individual</w:t>
+      </w:r>
+    </w:p>
+    <w:p>
+      <w:pPr>
+        <w:pStyle w:val="NormalWeb"/>
+        <w:rPr>
+          <w:rFonts w:ascii="Arial" w:hAnsi="Arial" w:cs="Arial"/>
+        </w:rPr>
+      </w:pPr>
+      <w:r>
+        <w:rPr>
+          <w:rFonts w:ascii="Arial" w:hAnsi="Arial" w:cs="Arial"/>
+        </w:rPr>
+        <w:t>Juan Pablo Correa Rave</w:t>
+      </w:r>
+    </w:p>
+    <w:p>
+      <w:pPr>
+        <w:pStyle w:val="NormalWeb"/>
+        <w:rPr>
+          <w:rFonts w:ascii="Arial" w:hAnsi="Arial" w:cs="Arial"/>
+        </w:rPr>
+      </w:pPr>
+      <w:r>
+        <w:rPr>
+          <w:rFonts w:ascii="Arial" w:hAnsi="Arial" w:cs="Arial"/>
+        </w:rPr>
+        <w:t>Participar en el diseño de la Red Social Pascualina me ayudó a entender lo importante que es pensar muy bien cómo se va a organizar la información antes de ponerse a hacer cualquier cosa en el computador. Al inicio uno cree que hacer una base de datos es solo crear tablas con nombres, pero al ir haciendo el ejercicio me di cuenta de que hay que ponerse en los zapatos del usuario para entender cómo interactúa con la aplicación.</w:t>
+      </w:r>
+    </w:p>
+    <w:p>
+      <w:pPr>
+        <w:pStyle w:val="NormalWeb"/>
+        <w:rPr>
+          <w:rFonts w:ascii="Arial" w:hAnsi="Arial" w:cs="Arial"/>
+        </w:rPr>
+      </w:pPr>
+      <w:r>
+        <w:rPr>
+          <w:rFonts w:ascii="Arial" w:hAnsi="Arial" w:cs="Arial"/>
+        </w:rPr>
+        <w:t xml:space="preserve">Lo que más me llamó la atención fue ver cómo cosas que uno usa todos los días en redes sociales reales como enviarle una solicitud a alguien, seguir a una persona o </w:t>
+      </w:r>
+      <w:r>
+        <w:rPr>
+          <w:rFonts w:ascii="Arial" w:hAnsi="Arial" w:cs="Arial"/>
+        </w:rPr>
+        <w:lastRenderedPageBreak/>
+        <w:t>mandar un mensaje en un grupo tienen un fondo detrás bastante detallado. Me pareció muy interesante entender por qué un chat no es lo mismo que un mensaje, o por qué seguir a alguien no significa automáticamente que ya sean amigos dentro de la plataforma.</w:t>
+      </w:r>
+    </w:p>
+    <w:p>
+      <w:pPr>
+        <w:pStyle w:val="NormalWeb"/>
+        <w:rPr>
+          <w:rFonts w:ascii="Arial" w:hAnsi="Arial" w:cs="Arial"/>
+        </w:rPr>
+      </w:pPr>
+      <w:r>
+        <w:rPr>
+          <w:rFonts w:ascii="Arial" w:hAnsi="Arial" w:cs="Arial"/>
+        </w:rPr>
+        <w:t>En lo personal, esta actividad me sirvió para perderle el miedo a la parte de diseño y darme cuenta de que el trabajo en equipo es clave para no pasar por alto detalles importantes. Siento que me deja una enseñanza muy valiosa para mi carrera, porque me enseñó a ser más analítico y a entender que un buen software depende completamente de qué tan bien planificada esté su base desde el principio.</w:t>
+      </w:r>
     </w:p>
     <w:p>
       <w:pPr>

</xml_diff>